<commit_message>
Agregar evidencias y documentación para la configuración de seguridad en el entorno de Apache. Se incluyen capturas de pantalla y archivos HTML que muestran la configuración de VirtualHosts, parámetros SSL y conexiones HTTPS para diferentes rutas del sistema. Se actualiza el informe maestro con secciones que documentan estas evidencias.
</commit_message>
<xml_diff>
--- a/seguridad/PAQUETE_ENVIO_ATDT_IDOR/INFORME_MAESTRO_ATDT_IDOR_PARA_WORD.docx
+++ b/seguridad/PAQUETE_ENVIO_ATDT_IDOR/INFORME_MAESTRO_ATDT_IDOR_PARA_WORD.docx
@@ -2,7 +2,7 @@
 <file path=word/document.xml><?xml version="1.0" encoding="utf-8"?>
 <w:document xmlns:w="http://schemas.openxmlformats.org/wordprocessingml/2006/main" xmlns:m="http://schemas.openxmlformats.org/officeDocument/2006/math" xmlns:r="http://schemas.openxmlformats.org/officeDocument/2006/relationships" xmlns:o="urn:schemas-microsoft-com:office:office" xmlns:v="urn:schemas-microsoft-com:vml" xmlns:w10="urn:schemas-microsoft-com:office:word" xmlns:a="http://schemas.openxmlformats.org/drawingml/2006/main" xmlns:pic="http://schemas.openxmlformats.org/drawingml/2006/picture" xmlns:wp="http://schemas.openxmlformats.org/drawingml/2006/wordprocessingDrawing">
   <w:body>
-    <w:bookmarkStart w:id="151" w:name="informe-maestro-de-cumplimiento-idorbola"/>
+    <w:bookmarkStart w:id="167" w:name="informe-maestro-de-cumplimiento-idorbola"/>
     <w:p>
       <w:pPr>
         <w:pStyle w:val="Heading1"/>
@@ -4056,7 +4056,7 @@
       </w:r>
     </w:p>
     <w:bookmarkEnd w:id="51"/>
-    <w:bookmarkStart w:id="150" w:name="anexos-a-h"/>
+    <w:bookmarkStart w:id="166" w:name="anexos-a-h"/>
     <w:p>
       <w:pPr>
         <w:pStyle w:val="Heading2"/>
@@ -11336,7 +11336,7 @@
     </w:p>
     <w:bookmarkEnd w:id="137"/>
     <w:bookmarkEnd w:id="138"/>
-    <w:bookmarkStart w:id="144" w:name="anexo-g"/>
+    <w:bookmarkStart w:id="160" w:name="anexo-g"/>
     <w:p>
       <w:pPr>
         <w:pStyle w:val="Heading3"/>
@@ -11859,8 +11859,529 @@
       </w:r>
     </w:p>
     <w:bookmarkEnd w:id="143"/>
-    <w:bookmarkEnd w:id="144"/>
-    <w:bookmarkStart w:id="149" w:name="anexo-h"/>
+    <w:bookmarkStart w:id="159" w:name="g.4.1-evidencia-integrada"/>
+    <w:p>
+      <w:pPr>
+        <w:pStyle w:val="Heading4"/>
+      </w:pPr>
+      <w:r>
+        <w:t xml:space="preserve">G.4.1 Evidencia integrada</w:t>
+      </w:r>
+    </w:p>
+    <w:p>
+      <w:pPr>
+        <w:pStyle w:val="FirstParagraph"/>
+      </w:pPr>
+      <w:r>
+        <w:t xml:space="preserve">Las siguientes capturas corresponden al listado G.4. Los extractos de Apache presentan rutas de sistema minimizadas (</w:t>
+      </w:r>
+      <w:r>
+        <w:rPr>
+          <w:rStyle w:val="VerbatimChar"/>
+        </w:rPr>
+        <w:t xml:space="preserve">/ruta/reservada/...</w:t>
+      </w:r>
+      <w:r>
+        <w:t xml:space="preserve">) de forma coherente con el fragmento de referencia G.2. Las evidencias de navegador combinan barra de direcciones con esquema</w:t>
+      </w:r>
+      <w:r>
+        <w:t xml:space="preserve"> </w:t>
+      </w:r>
+      <w:r>
+        <w:rPr>
+          <w:rStyle w:val="VerbatimChar"/>
+        </w:rPr>
+        <w:t xml:space="preserve">https://</w:t>
+      </w:r>
+      <w:r>
+        <w:t xml:space="preserve">, indicador de conexion segura (candado) y carga del contexto publicado en el servidor para cada ruta.</w:t>
+      </w:r>
+    </w:p>
+    <w:p>
+      <w:pPr>
+        <w:pStyle w:val="BodyText"/>
+      </w:pPr>
+      <w:r>
+        <w:rPr>
+          <w:bCs/>
+          <w:b/>
+        </w:rPr>
+        <w:t xml:space="preserve">Evidencia G_C1 — VirtualHost 80 y 443:</w:t>
+      </w:r>
+      <w:r>
+        <w:t xml:space="preserve"> </w:t>
+      </w:r>
+      <w:r>
+        <w:drawing>
+          <wp:inline>
+            <wp:extent cx="5334000" cy="4800600"/>
+            <wp:effectExtent b="0" l="0" r="0" t="0"/>
+            <wp:docPr descr="G_C1 httpd-vhosts 80 y 443" title="" id="145" name="Picture"/>
+            <a:graphic>
+              <a:graphicData uri="http://schemas.openxmlformats.org/drawingml/2006/picture">
+                <pic:pic>
+                  <pic:nvPicPr>
+                    <pic:cNvPr descr="04_Anexos/EVIDENCIAS/G_C1_Apache_httpd-vhosts_80_y_443.png" id="146" name="Picture"/>
+                    <pic:cNvPicPr>
+                      <a:picLocks noChangeArrowheads="1" noChangeAspect="1"/>
+                    </pic:cNvPicPr>
+                  </pic:nvPicPr>
+                  <pic:blipFill>
+                    <a:blip r:embed="rId144"/>
+                    <a:stretch>
+                      <a:fillRect/>
+                    </a:stretch>
+                  </pic:blipFill>
+                  <pic:spPr bwMode="auto">
+                    <a:xfrm>
+                      <a:off x="0" y="0"/>
+                      <a:ext cx="5334000" cy="4800600"/>
+                    </a:xfrm>
+                    <a:prstGeom prst="rect">
+                      <a:avLst/>
+                    </a:prstGeom>
+                    <a:noFill/>
+                    <a:ln w="9525">
+                      <a:noFill/>
+                      <a:headEnd/>
+                      <a:tailEnd/>
+                    </a:ln>
+                  </pic:spPr>
+                </pic:pic>
+              </a:graphicData>
+            </a:graphic>
+          </wp:inline>
+        </w:drawing>
+      </w:r>
+      <w:r>
+        <w:t xml:space="preserve"> </w:t>
+      </w:r>
+      <w:r>
+        <w:rPr>
+          <w:iCs/>
+          <w:i/>
+        </w:rPr>
+        <w:t xml:space="preserve">Pie de evidencia:</w:t>
+      </w:r>
+      <w:r>
+        <w:t xml:space="preserve"> </w:t>
+      </w:r>
+      <w:r>
+        <w:t xml:space="preserve">se observa redireccion permanente desde el VirtualHost en puerto 80 hacia HTTPS y VirtualHost en 443 con</w:t>
+      </w:r>
+      <w:r>
+        <w:t xml:space="preserve"> </w:t>
+      </w:r>
+      <w:r>
+        <w:rPr>
+          <w:rStyle w:val="VerbatimChar"/>
+        </w:rPr>
+        <w:t xml:space="preserve">SSLEngine on</w:t>
+      </w:r>
+      <w:r>
+        <w:t xml:space="preserve"> </w:t>
+      </w:r>
+      <w:r>
+        <w:t xml:space="preserve">y directivas de certificado (rutas reservadas en imagen).</w:t>
+      </w:r>
+    </w:p>
+    <w:p>
+      <w:pPr>
+        <w:pStyle w:val="BodyText"/>
+      </w:pPr>
+      <w:r>
+        <w:rPr>
+          <w:bCs/>
+          <w:b/>
+        </w:rPr>
+        <w:t xml:space="preserve">Evidencia G_C2 — Parametros globales SSL:</w:t>
+      </w:r>
+      <w:r>
+        <w:t xml:space="preserve"> </w:t>
+      </w:r>
+      <w:r>
+        <w:drawing>
+          <wp:inline>
+            <wp:extent cx="5334000" cy="3733800"/>
+            <wp:effectExtent b="0" l="0" r="0" t="0"/>
+            <wp:docPr descr="G_C2 httpd-ssl Listen ciphers cache" title="" id="148" name="Picture"/>
+            <a:graphic>
+              <a:graphicData uri="http://schemas.openxmlformats.org/drawingml/2006/picture">
+                <pic:pic>
+                  <pic:nvPicPr>
+                    <pic:cNvPr descr="04_Anexos/EVIDENCIAS/G_C2_Apache_httpd-ssl_listen_ciphers_cache.png" id="149" name="Picture"/>
+                    <pic:cNvPicPr>
+                      <a:picLocks noChangeArrowheads="1" noChangeAspect="1"/>
+                    </pic:cNvPicPr>
+                  </pic:nvPicPr>
+                  <pic:blipFill>
+                    <a:blip r:embed="rId147"/>
+                    <a:stretch>
+                      <a:fillRect/>
+                    </a:stretch>
+                  </pic:blipFill>
+                  <pic:spPr bwMode="auto">
+                    <a:xfrm>
+                      <a:off x="0" y="0"/>
+                      <a:ext cx="5334000" cy="3733800"/>
+                    </a:xfrm>
+                    <a:prstGeom prst="rect">
+                      <a:avLst/>
+                    </a:prstGeom>
+                    <a:noFill/>
+                    <a:ln w="9525">
+                      <a:noFill/>
+                      <a:headEnd/>
+                      <a:tailEnd/>
+                    </a:ln>
+                  </pic:spPr>
+                </pic:pic>
+              </a:graphicData>
+            </a:graphic>
+          </wp:inline>
+        </w:drawing>
+      </w:r>
+      <w:r>
+        <w:t xml:space="preserve"> </w:t>
+      </w:r>
+      <w:r>
+        <w:rPr>
+          <w:iCs/>
+          <w:i/>
+        </w:rPr>
+        <w:t xml:space="preserve">Pie de evidencia:</w:t>
+      </w:r>
+      <w:r>
+        <w:t xml:space="preserve"> </w:t>
+      </w:r>
+      <w:r>
+        <w:t xml:space="preserve">se documentan</w:t>
+      </w:r>
+      <w:r>
+        <w:t xml:space="preserve"> </w:t>
+      </w:r>
+      <w:r>
+        <w:rPr>
+          <w:rStyle w:val="VerbatimChar"/>
+        </w:rPr>
+        <w:t xml:space="preserve">Listen 443</w:t>
+      </w:r>
+      <w:r>
+        <w:t xml:space="preserve">,</w:t>
+      </w:r>
+      <w:r>
+        <w:t xml:space="preserve"> </w:t>
+      </w:r>
+      <w:r>
+        <w:rPr>
+          <w:rStyle w:val="VerbatimChar"/>
+        </w:rPr>
+        <w:t xml:space="preserve">SSLCipherSuite HIGH:MEDIUM:!aNULL:!MD5</w:t>
+      </w:r>
+      <w:r>
+        <w:t xml:space="preserve"> </w:t>
+      </w:r>
+      <w:r>
+        <w:t xml:space="preserve">y</w:t>
+      </w:r>
+      <w:r>
+        <w:t xml:space="preserve"> </w:t>
+      </w:r>
+      <w:r>
+        <w:rPr>
+          <w:rStyle w:val="VerbatimChar"/>
+        </w:rPr>
+        <w:t xml:space="preserve">SSLSessionCache</w:t>
+      </w:r>
+      <w:r>
+        <w:t xml:space="preserve"> </w:t>
+      </w:r>
+      <w:r>
+        <w:t xml:space="preserve">con mecanismo</w:t>
+      </w:r>
+      <w:r>
+        <w:t xml:space="preserve"> </w:t>
+      </w:r>
+      <w:r>
+        <w:rPr>
+          <w:rStyle w:val="VerbatimChar"/>
+        </w:rPr>
+        <w:t xml:space="preserve">shmcb</w:t>
+      </w:r>
+      <w:r>
+        <w:t xml:space="preserve"> </w:t>
+      </w:r>
+      <w:r>
+        <w:t xml:space="preserve">(ruta de cache reservada en imagen).</w:t>
+      </w:r>
+    </w:p>
+    <w:p>
+      <w:pPr>
+        <w:pStyle w:val="BodyText"/>
+      </w:pPr>
+      <w:r>
+        <w:rPr>
+          <w:bCs/>
+          <w:b/>
+        </w:rPr>
+        <w:t xml:space="preserve">Evidencia G_C3 — HTTPS /sce:</w:t>
+      </w:r>
+      <w:r>
+        <w:t xml:space="preserve"> </w:t>
+      </w:r>
+      <w:r>
+        <w:drawing>
+          <wp:inline>
+            <wp:extent cx="5334000" cy="4373880"/>
+            <wp:effectExtent b="0" l="0" r="0" t="0"/>
+            <wp:docPr descr="G_C3 TLS navegador SCE" title="" id="151" name="Picture"/>
+            <a:graphic>
+              <a:graphicData uri="http://schemas.openxmlformats.org/drawingml/2006/picture">
+                <pic:pic>
+                  <pic:nvPicPr>
+                    <pic:cNvPr descr="04_Anexos/EVIDENCIAS/G_C3_TLS_Navegador_SCE.png" id="152" name="Picture"/>
+                    <pic:cNvPicPr>
+                      <a:picLocks noChangeArrowheads="1" noChangeAspect="1"/>
+                    </pic:cNvPicPr>
+                  </pic:nvPicPr>
+                  <pic:blipFill>
+                    <a:blip r:embed="rId150"/>
+                    <a:stretch>
+                      <a:fillRect/>
+                    </a:stretch>
+                  </pic:blipFill>
+                  <pic:spPr bwMode="auto">
+                    <a:xfrm>
+                      <a:off x="0" y="0"/>
+                      <a:ext cx="5334000" cy="4373880"/>
+                    </a:xfrm>
+                    <a:prstGeom prst="rect">
+                      <a:avLst/>
+                    </a:prstGeom>
+                    <a:noFill/>
+                    <a:ln w="9525">
+                      <a:noFill/>
+                      <a:headEnd/>
+                      <a:tailEnd/>
+                    </a:ln>
+                  </pic:spPr>
+                </pic:pic>
+              </a:graphicData>
+            </a:graphic>
+          </wp:inline>
+        </w:drawing>
+      </w:r>
+      <w:r>
+        <w:t xml:space="preserve"> </w:t>
+      </w:r>
+      <w:r>
+        <w:rPr>
+          <w:iCs/>
+          <w:i/>
+        </w:rPr>
+        <w:t xml:space="preserve">Pie de evidencia:</w:t>
+      </w:r>
+      <w:r>
+        <w:t xml:space="preserve"> </w:t>
+      </w:r>
+      <w:r>
+        <w:t xml:space="preserve">URL publicada bajo</w:t>
+      </w:r>
+      <w:r>
+        <w:t xml:space="preserve"> </w:t>
+      </w:r>
+      <w:r>
+        <w:rPr>
+          <w:rStyle w:val="VerbatimChar"/>
+        </w:rPr>
+        <w:t xml:space="preserve">https://posgrados.inecol.mx/sce</w:t>
+      </w:r>
+      <w:r>
+        <w:t xml:space="preserve"> </w:t>
+      </w:r>
+      <w:r>
+        <w:t xml:space="preserve">con indicador de conexion segura y vista cargada del aplicativo en ese contexto.</w:t>
+      </w:r>
+    </w:p>
+    <w:p>
+      <w:pPr>
+        <w:pStyle w:val="BodyText"/>
+      </w:pPr>
+      <w:r>
+        <w:rPr>
+          <w:bCs/>
+          <w:b/>
+        </w:rPr>
+        <w:t xml:space="preserve">Evidencia G_C4 — HTTPS /sce_asp:</w:t>
+      </w:r>
+      <w:r>
+        <w:t xml:space="preserve"> </w:t>
+      </w:r>
+      <w:r>
+        <w:drawing>
+          <wp:inline>
+            <wp:extent cx="5334000" cy="4373880"/>
+            <wp:effectExtent b="0" l="0" r="0" t="0"/>
+            <wp:docPr descr="G_C4 TLS navegador SCE_ASP" title="" id="154" name="Picture"/>
+            <a:graphic>
+              <a:graphicData uri="http://schemas.openxmlformats.org/drawingml/2006/picture">
+                <pic:pic>
+                  <pic:nvPicPr>
+                    <pic:cNvPr descr="04_Anexos/EVIDENCIAS/G_C4_TLS_Navegador_SCE_ASP.png" id="155" name="Picture"/>
+                    <pic:cNvPicPr>
+                      <a:picLocks noChangeArrowheads="1" noChangeAspect="1"/>
+                    </pic:cNvPicPr>
+                  </pic:nvPicPr>
+                  <pic:blipFill>
+                    <a:blip r:embed="rId153"/>
+                    <a:stretch>
+                      <a:fillRect/>
+                    </a:stretch>
+                  </pic:blipFill>
+                  <pic:spPr bwMode="auto">
+                    <a:xfrm>
+                      <a:off x="0" y="0"/>
+                      <a:ext cx="5334000" cy="4373880"/>
+                    </a:xfrm>
+                    <a:prstGeom prst="rect">
+                      <a:avLst/>
+                    </a:prstGeom>
+                    <a:noFill/>
+                    <a:ln w="9525">
+                      <a:noFill/>
+                      <a:headEnd/>
+                      <a:tailEnd/>
+                    </a:ln>
+                  </pic:spPr>
+                </pic:pic>
+              </a:graphicData>
+            </a:graphic>
+          </wp:inline>
+        </w:drawing>
+      </w:r>
+      <w:r>
+        <w:t xml:space="preserve"> </w:t>
+      </w:r>
+      <w:r>
+        <w:rPr>
+          <w:iCs/>
+          <w:i/>
+        </w:rPr>
+        <w:t xml:space="preserve">Pie de evidencia:</w:t>
+      </w:r>
+      <w:r>
+        <w:t xml:space="preserve"> </w:t>
+      </w:r>
+      <w:r>
+        <w:t xml:space="preserve">URL publicada bajo</w:t>
+      </w:r>
+      <w:r>
+        <w:t xml:space="preserve"> </w:t>
+      </w:r>
+      <w:r>
+        <w:rPr>
+          <w:rStyle w:val="VerbatimChar"/>
+        </w:rPr>
+        <w:t xml:space="preserve">https://posgrados.inecol.mx/sce_asp</w:t>
+      </w:r>
+      <w:r>
+        <w:t xml:space="preserve"> </w:t>
+      </w:r>
+      <w:r>
+        <w:t xml:space="preserve">con indicador de conexion segura y vista cargada del aplicativo en ese contexto.</w:t>
+      </w:r>
+    </w:p>
+    <w:p>
+      <w:pPr>
+        <w:pStyle w:val="BodyText"/>
+      </w:pPr>
+      <w:r>
+        <w:rPr>
+          <w:bCs/>
+          <w:b/>
+        </w:rPr>
+        <w:t xml:space="preserve">Evidencia G_C5 — HTTPS /sce_enbc:</w:t>
+      </w:r>
+      <w:r>
+        <w:t xml:space="preserve"> </w:t>
+      </w:r>
+      <w:r>
+        <w:drawing>
+          <wp:inline>
+            <wp:extent cx="5334000" cy="4373880"/>
+            <wp:effectExtent b="0" l="0" r="0" t="0"/>
+            <wp:docPr descr="G_C5 TLS navegador SCE_ENBC" title="" id="157" name="Picture"/>
+            <a:graphic>
+              <a:graphicData uri="http://schemas.openxmlformats.org/drawingml/2006/picture">
+                <pic:pic>
+                  <pic:nvPicPr>
+                    <pic:cNvPr descr="04_Anexos/EVIDENCIAS/G_C5_TLS_Navegador_SCE_ENBC.png" id="158" name="Picture"/>
+                    <pic:cNvPicPr>
+                      <a:picLocks noChangeArrowheads="1" noChangeAspect="1"/>
+                    </pic:cNvPicPr>
+                  </pic:nvPicPr>
+                  <pic:blipFill>
+                    <a:blip r:embed="rId156"/>
+                    <a:stretch>
+                      <a:fillRect/>
+                    </a:stretch>
+                  </pic:blipFill>
+                  <pic:spPr bwMode="auto">
+                    <a:xfrm>
+                      <a:off x="0" y="0"/>
+                      <a:ext cx="5334000" cy="4373880"/>
+                    </a:xfrm>
+                    <a:prstGeom prst="rect">
+                      <a:avLst/>
+                    </a:prstGeom>
+                    <a:noFill/>
+                    <a:ln w="9525">
+                      <a:noFill/>
+                      <a:headEnd/>
+                      <a:tailEnd/>
+                    </a:ln>
+                  </pic:spPr>
+                </pic:pic>
+              </a:graphicData>
+            </a:graphic>
+          </wp:inline>
+        </w:drawing>
+      </w:r>
+      <w:r>
+        <w:t xml:space="preserve"> </w:t>
+      </w:r>
+      <w:r>
+        <w:rPr>
+          <w:iCs/>
+          <w:i/>
+        </w:rPr>
+        <w:t xml:space="preserve">Pie de evidencia:</w:t>
+      </w:r>
+      <w:r>
+        <w:t xml:space="preserve"> </w:t>
+      </w:r>
+      <w:r>
+        <w:t xml:space="preserve">URL publicada bajo</w:t>
+      </w:r>
+      <w:r>
+        <w:t xml:space="preserve"> </w:t>
+      </w:r>
+      <w:r>
+        <w:rPr>
+          <w:rStyle w:val="VerbatimChar"/>
+        </w:rPr>
+        <w:t xml:space="preserve">https://posgrados.inecol.mx/sce_enbc</w:t>
+      </w:r>
+      <w:r>
+        <w:t xml:space="preserve"> </w:t>
+      </w:r>
+      <w:r>
+        <w:t xml:space="preserve">con indicador de conexion segura y vista cargada del aplicativo en ese contexto.</w:t>
+      </w:r>
+    </w:p>
+    <w:bookmarkEnd w:id="159"/>
+    <w:bookmarkEnd w:id="160"/>
+    <w:bookmarkStart w:id="165" w:name="anexo-h"/>
     <w:p>
       <w:pPr>
         <w:pStyle w:val="Heading3"/>
@@ -11869,7 +12390,7 @@
         <w:t xml:space="preserve">Anexo H</w:t>
       </w:r>
     </w:p>
-    <w:bookmarkStart w:id="145" w:name="plan-de-cierre-y-control-de-seguimiento"/>
+    <w:bookmarkStart w:id="161" w:name="plan-de-cierre-y-control-de-seguimiento"/>
     <w:p>
       <w:pPr>
         <w:pStyle w:val="Heading4"/>
@@ -11878,8 +12399,8 @@
         <w:t xml:space="preserve">Plan de cierre y control de seguimiento</w:t>
       </w:r>
     </w:p>
-    <w:bookmarkEnd w:id="145"/>
-    <w:bookmarkStart w:id="146" w:name="h.1-acciones-de-cierre"/>
+    <w:bookmarkEnd w:id="161"/>
+    <w:bookmarkStart w:id="162" w:name="h.1-acciones-de-cierre"/>
     <w:p>
       <w:pPr>
         <w:pStyle w:val="Heading4"/>
@@ -12140,8 +12661,8 @@
         </w:tc>
       </w:tr>
     </w:tbl>
-    <w:bookmarkEnd w:id="146"/>
-    <w:bookmarkStart w:id="147" w:name="X0f9fae65e97ced3ee490a3bacc3bb8320d16199"/>
+    <w:bookmarkEnd w:id="162"/>
+    <w:bookmarkStart w:id="163" w:name="X0f9fae65e97ced3ee490a3bacc3bb8320d16199"/>
     <w:p>
       <w:pPr>
         <w:pStyle w:val="Heading4"/>
@@ -12222,8 +12743,8 @@
         <w:t xml:space="preserve">Evidencia operativa de pruebas negativas con bloqueo funcional y trazabilidad en bitacora.</w:t>
       </w:r>
     </w:p>
-    <w:bookmarkEnd w:id="147"/>
-    <w:bookmarkStart w:id="148" w:name="h.3-criterio-de-cierre-institucional"/>
+    <w:bookmarkEnd w:id="163"/>
+    <w:bookmarkStart w:id="164" w:name="h.3-criterio-de-cierre-institucional"/>
     <w:p>
       <w:pPr>
         <w:pStyle w:val="Heading4"/>
@@ -12268,10 +12789,10 @@
         <w:t xml:space="preserve">El informe se emite como documento institucional consolidado, con evidencias tecnicas y documentales verificables.</w:t>
       </w:r>
     </w:p>
-    <w:bookmarkEnd w:id="148"/>
-    <w:bookmarkEnd w:id="149"/>
-    <w:bookmarkEnd w:id="150"/>
-    <w:bookmarkEnd w:id="151"/>
+    <w:bookmarkEnd w:id="164"/>
+    <w:bookmarkEnd w:id="165"/>
+    <w:bookmarkEnd w:id="166"/>
+    <w:bookmarkEnd w:id="167"/>
     <w:sectPr/>
   </w:body>
 </w:document>

</xml_diff>